<commit_message>
CHEERS checklist: quote the proving sentence for each item, not a section name
The far-right column named a section ("Methods") for each of the 28 CHEERS
2022 items, requiring a reviewer to search the manuscript to confirm each
claim. Replaced with the actual sentence(s) from manuscript.qmd/title_page.qmd
that satisfy each item. Items 27-28 (funding, conflicts of interest) now
explicitly state no sentence can be quoted yet, since the title page's
disclosure fields are still placeholders pending the author's content.
</commit_message>
<xml_diff>
--- a/manuscript/cheers_checklist.docx
+++ b/manuscript/cheers_checklist.docx
@@ -30,6 +30,26 @@
         <w:t xml:space="preserve">Strategies for Lynch Syndrome Surveillance: A Decision-Analytic Model.</w:t>
       </w:r>
     </w:p>
+    <w:p>
+      <w:pPr>
+        <w:pStyle w:val="BodyText"/>
+      </w:pPr>
+      <w:r>
+        <w:t xml:space="preserve">Per the journal’s request, the far-right column below does not merely name a</w:t>
+      </w:r>
+      <w:r>
+        <w:t xml:space="preserve"> </w:t>
+      </w:r>
+      <w:r>
+        <w:t xml:space="preserve">section – it quotes the actual sentence(s) from the manuscript that satisfy</w:t>
+      </w:r>
+      <w:r>
+        <w:t xml:space="preserve"> </w:t>
+      </w:r>
+      <w:r>
+        <w:t xml:space="preserve">each item, so a reviewer can verify the claim without searching the text.</w:t>
+      </w:r>
+    </w:p>
     <w:tbl>
       <w:tblPr>
         <w:tblStyle w:val="Table"/>
@@ -87,7 +107,7 @@
               <w:pStyle w:val="Compact"/>
             </w:pPr>
             <w:r>
-              <w:t xml:space="preserve">Reported in section</w:t>
+              <w:t xml:space="preserve">Reported in section (supporting text)</w:t>
             </w:r>
           </w:p>
         </w:tc>
@@ -133,7 +153,33 @@
               <w:pStyle w:val="Compact"/>
             </w:pPr>
             <w:r>
-              <w:t xml:space="preserve">Title</w:t>
+              <w:rPr>
+                <w:b/>
+                <w:bCs/>
+              </w:rPr>
+              <w:t xml:space="preserve">Title.</w:t>
+            </w:r>
+            <w:r>
+              <w:t xml:space="preserve"> </w:t>
+            </w:r>
+            <w:r>
+              <w:t xml:space="preserve">“Cost-Minimization of Endometrial Biopsy Strategies for Lynch Syndrome Surveillance: A Decision-Analytic Model.”</w:t>
+            </w:r>
+            <w:r>
+              <w:t xml:space="preserve"> </w:t>
+            </w:r>
+            <w:r>
+              <w:rPr>
+                <w:b/>
+                <w:bCs/>
+              </w:rPr>
+              <w:t xml:space="preserve">Abstract, Objective.</w:t>
+            </w:r>
+            <w:r>
+              <w:t xml:space="preserve"> </w:t>
+            </w:r>
+            <w:r>
+              <w:t xml:space="preserve">“To estimate and compare the health-system costs of three strategies for endometrial cancer surveillance in women with Lynch syndrome: standalone office endometrial biopsy, operative dilation and curettage (D&amp;C), and endometrial biopsy performed during an already-scheduled surveillance colonoscopy.”</w:t>
             </w:r>
           </w:p>
         </w:tc>
@@ -179,7 +225,17 @@
               <w:pStyle w:val="Compact"/>
             </w:pPr>
             <w:r>
-              <w:t xml:space="preserve">Abstract</w:t>
+              <w:rPr>
+                <w:b/>
+                <w:bCs/>
+              </w:rPr>
+              <w:t xml:space="preserve">Abstract, Methods.</w:t>
+            </w:r>
+            <w:r>
+              <w:t xml:space="preserve"> </w:t>
+            </w:r>
+            <w:r>
+              <w:t xml:space="preserve">“We conducted deterministic and probabilistic sensitivity analyses (1,000 Monte Carlo draws), a threshold analysis, a budget-impact analysis, a geographic sensitivity analysis using real Medicare Geographic Practice Cost Indices and hospital wage indices across four localities, and two supplementary clinical-outcome sensitivity analyses testing the model’s assumption of equivalent diagnostic effectiveness across strategies.”</w:t>
             </w:r>
           </w:p>
         </w:tc>
@@ -225,7 +281,17 @@
               <w:pStyle w:val="Compact"/>
             </w:pPr>
             <w:r>
-              <w:t xml:space="preserve">Introduction</w:t>
+              <w:rPr>
+                <w:b/>
+                <w:bCs/>
+              </w:rPr>
+              <w:t xml:space="preserve">Introduction, final paragraph.</w:t>
+            </w:r>
+            <w:r>
+              <w:t xml:space="preserve"> </w:t>
+            </w:r>
+            <w:r>
+              <w:t xml:space="preserve">“We built a decision-analytic, cost-minimization model to estimate and compare the health-system costs of these three strategies, and to test, rather than assume, whether the model’s cost conclusion depends on the assumption of equivalent diagnostic effectiveness across strategies, on Medicare-derived parameter uncertainty, or on practice location.”</w:t>
             </w:r>
           </w:p>
         </w:tc>
@@ -271,7 +337,17 @@
               <w:pStyle w:val="Compact"/>
             </w:pPr>
             <w:r>
-              <w:t xml:space="preserve">Methods</w:t>
+              <w:rPr>
+                <w:b/>
+                <w:bCs/>
+              </w:rPr>
+              <w:t xml:space="preserve">Methods, opening paragraph.</w:t>
+            </w:r>
+            <w:r>
+              <w:t xml:space="preserve"> </w:t>
+            </w:r>
+            <w:r>
+              <w:t xml:space="preserve">“No prespecified health economic analysis plan was registered before the analysis began; complete parameter-level sourcing is provided as supplementary material.”</w:t>
             </w:r>
           </w:p>
         </w:tc>
@@ -317,7 +393,17 @@
               <w:pStyle w:val="Compact"/>
             </w:pPr>
             <w:r>
-              <w:t xml:space="preserve">Methods</w:t>
+              <w:rPr>
+                <w:b/>
+                <w:bCs/>
+              </w:rPr>
+              <w:t xml:space="preserve">Methods, opening paragraph.</w:t>
+            </w:r>
+            <w:r>
+              <w:t xml:space="preserve"> </w:t>
+            </w:r>
+            <w:r>
+              <w:t xml:space="preserve">“…adult women with Lynch syndrome who are candidates for gynecologic surveillance and have an already-scheduled surveillance colonoscopy… Age, genotype, menopausal status, and prior biopsy history were not modeled separately; the model represents a single surveillance episode rather than a specific patient subgroup.”</w:t>
             </w:r>
           </w:p>
         </w:tc>
@@ -363,7 +449,33 @@
               <w:pStyle w:val="Compact"/>
             </w:pPr>
             <w:r>
-              <w:t xml:space="preserve">Methods</w:t>
+              <w:rPr>
+                <w:b/>
+                <w:bCs/>
+              </w:rPr>
+              <w:t xml:space="preserve">Methods, second paragraph.</w:t>
+            </w:r>
+            <w:r>
+              <w:t xml:space="preserve"> </w:t>
+            </w:r>
+            <w:r>
+              <w:t xml:space="preserve">“Healthcare resources were valued primarily using Medicare allowed amounts (the Physician Fee Schedule and the Physician &amp; Other Practitioners by Provider and Service Public Use Files)…”</w:t>
+            </w:r>
+            <w:r>
+              <w:t xml:space="preserve"> </w:t>
+            </w:r>
+            <w:r>
+              <w:rPr>
+                <w:b/>
+                <w:bCs/>
+              </w:rPr>
+              <w:t xml:space="preserve">Methods, geographic-sensitivity paragraph.</w:t>
+            </w:r>
+            <w:r>
+              <w:t xml:space="preserve"> </w:t>
+            </w:r>
+            <w:r>
+              <w:t xml:space="preserve">“…we re-priced all three strategies at four localities: the national average, a mid-cost state, a low-cost locality, and a high-cost locality.”</w:t>
             </w:r>
           </w:p>
         </w:tc>
@@ -409,7 +521,33 @@
               <w:pStyle w:val="Compact"/>
             </w:pPr>
             <w:r>
-              <w:t xml:space="preserve">Methods; Introduction</w:t>
+              <w:rPr>
+                <w:b/>
+                <w:bCs/>
+              </w:rPr>
+              <w:t xml:space="preserve">Methods, opening paragraph.</w:t>
+            </w:r>
+            <w:r>
+              <w:t xml:space="preserve"> </w:t>
+            </w:r>
+            <w:r>
+              <w:t xml:space="preserve">“…standalone office endometrial biopsy, operative dilation and curettage (D&amp;C), and endometrial biopsy performed during that colonoscopy (combined biopsy).”</w:t>
+            </w:r>
+            <w:r>
+              <w:t xml:space="preserve"> </w:t>
+            </w:r>
+            <w:r>
+              <w:rPr>
+                <w:b/>
+                <w:bCs/>
+              </w:rPr>
+              <w:t xml:space="preserve">Introduction.</w:t>
+            </w:r>
+            <w:r>
+              <w:t xml:space="preserve"> </w:t>
+            </w:r>
+            <w:r>
+              <w:t xml:space="preserve">“…whether this combined approach is also less costly to the health system than the two existing alternatives – standalone office biopsy or operative dilation and curettage (D&amp;C) – once the full cost of an escalation to D&amp;C after a failed sampling attempt is accounted for in each strategy.”</w:t>
             </w:r>
           </w:p>
         </w:tc>
@@ -455,7 +593,17 @@
               <w:pStyle w:val="Compact"/>
             </w:pPr>
             <w:r>
-              <w:t xml:space="preserve">Methods</w:t>
+              <w:rPr>
+                <w:b/>
+                <w:bCs/>
+              </w:rPr>
+              <w:t xml:space="preserve">Methods, second paragraph.</w:t>
+            </w:r>
+            <w:r>
+              <w:t xml:space="preserve"> </w:t>
+            </w:r>
+            <w:r>
+              <w:t xml:space="preserve">“The analysis took a U.S. healthcare-sector perspective. Healthcare resources were valued primarily using Medicare allowed amounts… supplemented by published resource-cost estimates for services not separately reimbursed, such as incremental procedure-room and anesthesia time and scheduling-coordination labor. Patient time, transportation, lost productivity, and other nonmedical costs were excluded.”</w:t>
             </w:r>
           </w:p>
         </w:tc>
@@ -501,7 +649,17 @@
               <w:pStyle w:val="Compact"/>
             </w:pPr>
             <w:r>
-              <w:t xml:space="preserve">Methods</w:t>
+              <w:rPr>
+                <w:b/>
+                <w:bCs/>
+              </w:rPr>
+              <w:t xml:space="preserve">Methods, second paragraph.</w:t>
+            </w:r>
+            <w:r>
+              <w:t xml:space="preserve"> </w:t>
+            </w:r>
+            <w:r>
+              <w:t xml:space="preserve">“The analytic horizon was a single endometrial-surveillance episode, beginning with the initial sampling strategy and extending through any rescue D&amp;C required after an unsuccessful initial attempt; costs or consequences beyond resolution of that episode were not included.”</w:t>
             </w:r>
           </w:p>
         </w:tc>
@@ -547,7 +705,17 @@
               <w:pStyle w:val="Compact"/>
             </w:pPr>
             <w:r>
-              <w:t xml:space="preserve">Methods</w:t>
+              <w:rPr>
+                <w:b/>
+                <w:bCs/>
+              </w:rPr>
+              <w:t xml:space="preserve">Methods, second paragraph.</w:t>
+            </w:r>
+            <w:r>
+              <w:t xml:space="preserve"> </w:t>
+            </w:r>
+            <w:r>
+              <w:t xml:space="preserve">“Because the horizon was less than one year, costs were not discounted.”</w:t>
             </w:r>
           </w:p>
         </w:tc>
@@ -593,7 +761,17 @@
               <w:pStyle w:val="Compact"/>
             </w:pPr>
             <w:r>
-              <w:t xml:space="preserve">Methods</w:t>
+              <w:rPr>
+                <w:b/>
+                <w:bCs/>
+              </w:rPr>
+              <w:t xml:space="preserve">Methods, third paragraph.</w:t>
+            </w:r>
+            <w:r>
+              <w:t xml:space="preserve"> </w:t>
+            </w:r>
+            <w:r>
+              <w:t xml:space="preserve">“Total expected cost per patient was the primary outcome, selected because the decision this model addresses… is, in the base case, a cost-minimization question… we selected two secondary outcomes – D&amp;C-related adverse-event exposure and delayed-neoplasia probability – specifically to test, rather than merely assume, this equivalence.”</w:t>
             </w:r>
           </w:p>
         </w:tc>
@@ -639,7 +817,33 @@
               <w:pStyle w:val="Compact"/>
             </w:pPr>
             <w:r>
-              <w:t xml:space="preserve">Methods; Figure 1</w:t>
+              <w:rPr>
+                <w:b/>
+                <w:bCs/>
+              </w:rPr>
+              <w:t xml:space="preserve">Methods, clinical-outcome-sensitivity paragraph.</w:t>
+            </w:r>
+            <w:r>
+              <w:t xml:space="preserve"> </w:t>
+            </w:r>
+            <w:r>
+              <w:t xml:space="preserve">“…we estimated each strategy’s exposure to D&amp;C-related adverse events (a composite of uterine perforation, cervical false passage, and severe hemorrhage, pooled from a cohort of 5,359 nonobstetric D&amp;Cs) as a function of that strategy’s probability of ultimately requiring D&amp;C, either as the primary procedure or as a rescue procedure after a failed sampling attempt.”</w:t>
+            </w:r>
+            <w:r>
+              <w:t xml:space="preserve"> </w:t>
+            </w:r>
+            <w:r>
+              <w:rPr>
+                <w:b/>
+                <w:bCs/>
+              </w:rPr>
+              <w:t xml:space="preserve">Figure 1</w:t>
+            </w:r>
+            <w:r>
+              <w:t xml:space="preserve"> </w:t>
+            </w:r>
+            <w:r>
+              <w:t xml:space="preserve">shows the structural pathway used to derive these estimates.</w:t>
             </w:r>
           </w:p>
         </w:tc>
@@ -685,7 +889,17 @@
               <w:pStyle w:val="Compact"/>
             </w:pPr>
             <w:r>
-              <w:t xml:space="preserve">Methods</w:t>
+              <w:rPr>
+                <w:b/>
+                <w:bCs/>
+              </w:rPr>
+              <w:t xml:space="preserve">Methods, third paragraph.</w:t>
+            </w:r>
+            <w:r>
+              <w:t xml:space="preserve"> </w:t>
+            </w:r>
+            <w:r>
+              <w:t xml:space="preserve">“Both secondary outcomes are reported as event counts per 1,000 patients; neither was converted to a utility, quality-adjusted life-year, or monetary value, so no outcome valuation step was required for them.”</w:t>
             </w:r>
           </w:p>
         </w:tc>
@@ -731,7 +945,33 @@
               <w:pStyle w:val="Compact"/>
             </w:pPr>
             <w:r>
-              <w:t xml:space="preserve">Methods; Table 1</w:t>
+              <w:rPr>
+                <w:b/>
+                <w:bCs/>
+              </w:rPr>
+              <w:t xml:space="preserve">Methods, second paragraph.</w:t>
+            </w:r>
+            <w:r>
+              <w:t xml:space="preserve"> </w:t>
+            </w:r>
+            <w:r>
+              <w:t xml:space="preserve">“Healthcare resources were valued primarily using Medicare allowed amounts… supplemented by published resource-cost estimates for services not separately reimbursed…”</w:t>
+            </w:r>
+            <w:r>
+              <w:t xml:space="preserve"> </w:t>
+            </w:r>
+            <w:r>
+              <w:rPr>
+                <w:b/>
+                <w:bCs/>
+              </w:rPr>
+              <w:t xml:space="preserve">Table 1</w:t>
+            </w:r>
+            <w:r>
+              <w:t xml:space="preserve"> </w:t>
+            </w:r>
+            <w:r>
+              <w:t xml:space="preserve">lists the source citation and evidence tier used to value every individual cost input.</w:t>
             </w:r>
           </w:p>
         </w:tc>
@@ -777,7 +1017,17 @@
               <w:pStyle w:val="Compact"/>
             </w:pPr>
             <w:r>
-              <w:t xml:space="preserve">Methods</w:t>
+              <w:rPr>
+                <w:b/>
+                <w:bCs/>
+              </w:rPr>
+              <w:t xml:space="preserve">Methods, second paragraph.</w:t>
+            </w:r>
+            <w:r>
+              <w:t xml:space="preserve"> </w:t>
+            </w:r>
+            <w:r>
+              <w:t xml:space="preserve">“All costs are reported in 2026 U.S. dollars; costs originally reported in an earlier year were inflation-adjusted using the Bureau of Labor Statistics Consumer Price Index for Medical Care.”</w:t>
             </w:r>
           </w:p>
         </w:tc>
@@ -823,7 +1073,33 @@
               <w:pStyle w:val="Compact"/>
             </w:pPr>
             <w:r>
-              <w:t xml:space="preserve">Methods; Figure 1</w:t>
+              <w:rPr>
+                <w:b/>
+                <w:bCs/>
+              </w:rPr>
+              <w:t xml:space="preserve">Methods, fourth paragraph.</w:t>
+            </w:r>
+            <w:r>
+              <w:t xml:space="preserve"> </w:t>
+            </w:r>
+            <w:r>
+              <w:t xml:space="preserve">“Each strategy was modeled as a one-step decision tree: an initial sampling attempt, which either succeeds or fails and escalates to operative D&amp;C… The combined-biopsy arm was modeled under an incremental-cost principle: because the patient is assumed to be undergoing the surveillance colonoscopy regardless of whether biopsy is added, no colonoscopy base cost… was charged to this arm.”</w:t>
+            </w:r>
+            <w:r>
+              <w:t xml:space="preserve"> </w:t>
+            </w:r>
+            <w:r>
+              <w:rPr>
+                <w:b/>
+                <w:bCs/>
+              </w:rPr>
+              <w:t xml:space="preserve">Figure 1</w:t>
+            </w:r>
+            <w:r>
+              <w:t xml:space="preserve"> </w:t>
+            </w:r>
+            <w:r>
+              <w:t xml:space="preserve">is the corresponding decision-tree diagram, built directly from live model output.</w:t>
             </w:r>
           </w:p>
         </w:tc>
@@ -869,7 +1145,49 @@
               <w:pStyle w:val="Compact"/>
             </w:pPr>
             <w:r>
-              <w:t xml:space="preserve">Methods; Table 1</w:t>
+              <w:rPr>
+                <w:b/>
+                <w:bCs/>
+              </w:rPr>
+              <w:t xml:space="preserve">Methods, five-analyses paragraph.</w:t>
+            </w:r>
+            <w:r>
+              <w:t xml:space="preserve"> </w:t>
+            </w:r>
+            <w:r>
+              <w:t xml:space="preserve">“We conducted five complementary sensitivity analyses. First, deterministic one-way sensitivity analysis… Second, probabilistic sensitivity analysis… Third, threshold analysis… Fourth, scenario analysis… Fifth, budget-impact analysis…”</w:t>
+            </w:r>
+            <w:r>
+              <w:t xml:space="preserve"> </w:t>
+            </w:r>
+            <w:r>
+              <w:rPr>
+                <w:b/>
+                <w:bCs/>
+              </w:rPr>
+              <w:t xml:space="preserve">Methods, validation paragraph.</w:t>
+            </w:r>
+            <w:r>
+              <w:t xml:space="preserve"> </w:t>
+            </w:r>
+            <w:r>
+              <w:t xml:space="preserve">“We compared the model’s cost estimates against three independently published analyses as a validation check…”</w:t>
+            </w:r>
+            <w:r>
+              <w:t xml:space="preserve"> </w:t>
+            </w:r>
+            <w:r>
+              <w:rPr>
+                <w:b/>
+                <w:bCs/>
+              </w:rPr>
+              <w:t xml:space="preserve">Table 1</w:t>
+            </w:r>
+            <w:r>
+              <w:t xml:space="preserve"> </w:t>
+            </w:r>
+            <w:r>
+              <w:t xml:space="preserve">documents every structural assumption’s source and evidence tier.</w:t>
             </w:r>
           </w:p>
         </w:tc>
@@ -915,7 +1233,17 @@
               <w:pStyle w:val="Compact"/>
             </w:pPr>
             <w:r>
-              <w:t xml:space="preserve">Methods</w:t>
+              <w:rPr>
+                <w:b/>
+                <w:bCs/>
+              </w:rPr>
+              <w:t xml:space="preserve">Methods, penultimate paragraph.</w:t>
+            </w:r>
+            <w:r>
+              <w:t xml:space="preserve"> </w:t>
+            </w:r>
+            <w:r>
+              <w:t xml:space="preserve">“The geographic sensitivity analysis characterizes setting-level heterogeneity (how the base-case conclusion varies by practice location); it does not characterize patient-level heterogeneity, which was not modeled – the model does not stratify results by age, genotype, menopausal status, or other individual patient characteristics.”</w:t>
             </w:r>
           </w:p>
         </w:tc>
@@ -961,7 +1289,17 @@
               <w:pStyle w:val="Compact"/>
             </w:pPr>
             <w:r>
-              <w:t xml:space="preserve">Methods</w:t>
+              <w:rPr>
+                <w:b/>
+                <w:bCs/>
+              </w:rPr>
+              <w:t xml:space="preserve">Methods, penultimate paragraph.</w:t>
+            </w:r>
+            <w:r>
+              <w:t xml:space="preserve"> </w:t>
+            </w:r>
+            <w:r>
+              <w:t xml:space="preserve">“Distributional or equity effects (e.g., differential access or affordability across patient subgroups) were outside this analysis’s scope.”</w:t>
             </w:r>
           </w:p>
         </w:tc>
@@ -1007,7 +1345,17 @@
               <w:pStyle w:val="Compact"/>
             </w:pPr>
             <w:r>
-              <w:t xml:space="preserve">Methods</w:t>
+              <w:rPr>
+                <w:b/>
+                <w:bCs/>
+              </w:rPr>
+              <w:t xml:space="preserve">Methods, five-analyses paragraph.</w:t>
+            </w:r>
+            <w:r>
+              <w:t xml:space="preserve"> </w:t>
+            </w:r>
+            <w:r>
+              <w:t xml:space="preserve">“First, deterministic one-way sensitivity analysis varied each of ten parameters individually across its low/high bound… Second, probabilistic sensitivity analysis drew 1,000 Monte Carlo samples, with each parameter sampled from a distribution matched to its evidence type… Third, threshold analysis solved for the parameter value at which the combined strategy’s cost advantage over office biopsy would be lost.”</w:t>
             </w:r>
           </w:p>
         </w:tc>
@@ -1053,7 +1401,17 @@
               <w:pStyle w:val="Compact"/>
             </w:pPr>
             <w:r>
-              <w:t xml:space="preserve">Methods</w:t>
+              <w:rPr>
+                <w:b/>
+                <w:bCs/>
+              </w:rPr>
+              <w:t xml:space="preserve">Methods, penultimate paragraph.</w:t>
+            </w:r>
+            <w:r>
+              <w:t xml:space="preserve"> </w:t>
+            </w:r>
+            <w:r>
+              <w:t xml:space="preserve">“Structural modeling assumptions describing actual clinical workflow (e.g., whether the combined-biopsy strategy requires a separate preoperative office visit) were informed by clinician-investigator practice experience; no formal patient or public engagement process was undertaken in developing this model.”</w:t>
             </w:r>
           </w:p>
         </w:tc>
@@ -1099,7 +1457,36 @@
               <w:pStyle w:val="Compact"/>
             </w:pPr>
             <w:r>
-              <w:t xml:space="preserve">Table 1 (</w:t>
+              <w:rPr>
+                <w:b/>
+                <w:bCs/>
+              </w:rPr>
+              <w:t xml:space="preserve">Table 1</w:t>
+            </w:r>
+            <w:r>
+              <w:t xml:space="preserve"> </w:t>
+            </w:r>
+            <w:r>
+              <w:t xml:space="preserve">caption.</w:t>
+            </w:r>
+            <w:r>
+              <w:t xml:space="preserve"> </w:t>
+            </w:r>
+            <w:r>
+              <w:t xml:space="preserve">“Model parameters: base-case value, low/high bound, distribution, source citation, and evidence tier for every parameter in the model.”</w:t>
+            </w:r>
+            <w:r>
+              <w:t xml:space="preserve"> </w:t>
+            </w:r>
+            <w:r>
+              <w:rPr>
+                <w:i/>
+                <w:iCs/>
+              </w:rPr>
+              <w:t xml:space="preserve">Source:</w:t>
+            </w:r>
+            <w:r>
+              <w:t xml:space="preserve"> </w:t>
             </w:r>
             <w:r>
               <w:rPr>
@@ -1108,7 +1495,7 @@
               <w:t xml:space="preserve">tables/manuscript_table1_parameters.csv</w:t>
             </w:r>
             <w:r>
-              <w:t xml:space="preserve">)</w:t>
+              <w:t xml:space="preserve">.</w:t>
             </w:r>
           </w:p>
         </w:tc>
@@ -1154,7 +1541,33 @@
               <w:pStyle w:val="Compact"/>
             </w:pPr>
             <w:r>
-              <w:t xml:space="preserve">Results; Table 2</w:t>
+              <w:rPr>
+                <w:b/>
+                <w:bCs/>
+              </w:rPr>
+              <w:t xml:space="preserve">Results, first paragraph.</w:t>
+            </w:r>
+            <w:r>
+              <w:t xml:space="preserve"> </w:t>
+            </w:r>
+            <w:r>
+              <w:t xml:space="preserve">“In the base case, combined biopsy cost an estimated $505.88 per patient, compared with $764.93 for standalone office biopsy and $3,827.04 for operative D&amp;C. Combined biopsy was $259.04 (33.9%) less expensive than office biopsy…”</w:t>
+            </w:r>
+            <w:r>
+              <w:t xml:space="preserve"> </w:t>
+            </w:r>
+            <w:r>
+              <w:rPr>
+                <w:b/>
+                <w:bCs/>
+              </w:rPr>
+              <w:t xml:space="preserve">Table 2</w:t>
+            </w:r>
+            <w:r>
+              <w:t xml:space="preserve"> </w:t>
+            </w:r>
+            <w:r>
+              <w:t xml:space="preserve">summarizes cost and clinical-outcome means by strategy.</w:t>
             </w:r>
           </w:p>
         </w:tc>
@@ -1200,7 +1613,33 @@
               <w:pStyle w:val="Compact"/>
             </w:pPr>
             <w:r>
-              <w:t xml:space="preserve">Results</w:t>
+              <w:rPr>
+                <w:b/>
+                <w:bCs/>
+              </w:rPr>
+              <w:t xml:space="preserve">Results.</w:t>
+            </w:r>
+            <w:r>
+              <w:t xml:space="preserve"> </w:t>
+            </w:r>
+            <w:r>
+              <w:t xml:space="preserve">“Across 1,000 probabilistic-sensitivity draws, combined biopsy had a mean cost of $536.50 (SD $113.50) and office biopsy a mean cost of $678.20 (SD $114.50). Combined biopsy was the least expensive strategy in 82.0% of draws; D&amp;C was never the least expensive strategy in any draw.”</w:t>
+            </w:r>
+            <w:r>
+              <w:t xml:space="preserve"> </w:t>
+            </w:r>
+            <w:r>
+              <w:rPr>
+                <w:b/>
+                <w:bCs/>
+              </w:rPr>
+              <w:t xml:space="preserve">Results, geographic paragraph.</w:t>
+            </w:r>
+            <w:r>
+              <w:t xml:space="preserve"> </w:t>
+            </w:r>
+            <w:r>
+              <w:t xml:space="preserve">“Combined biopsy remained the least expensive strategy in all four localities tested.”</w:t>
             </w:r>
           </w:p>
         </w:tc>
@@ -1246,7 +1685,17 @@
               <w:pStyle w:val="Compact"/>
             </w:pPr>
             <w:r>
-              <w:t xml:space="preserve">Methods</w:t>
+              <w:rPr>
+                <w:b/>
+                <w:bCs/>
+              </w:rPr>
+              <w:t xml:space="preserve">Methods, penultimate paragraph.</w:t>
+            </w:r>
+            <w:r>
+              <w:t xml:space="preserve"> </w:t>
+            </w:r>
+            <w:r>
+              <w:t xml:space="preserve">Same sentence as item 21, naming the specific structural assumption – whether the combined arm requires a separate preoperative office visit – that clinician-investigator input affected, since no formal patient/public engagement was undertaken.</w:t>
             </w:r>
           </w:p>
         </w:tc>
@@ -1292,7 +1741,33 @@
               <w:pStyle w:val="Compact"/>
             </w:pPr>
             <w:r>
-              <w:t xml:space="preserve">Discussion</w:t>
+              <w:rPr>
+                <w:b/>
+                <w:bCs/>
+              </w:rPr>
+              <w:t xml:space="preserve">Discussion, second paragraph.</w:t>
+            </w:r>
+            <w:r>
+              <w:t xml:space="preserve"> </w:t>
+            </w:r>
+            <w:r>
+              <w:t xml:space="preserve">“This model’s principal limitation is that its cost-minimization design formally assumes equivalent diagnostic effectiveness across strategies, and our attempt to test that assumption directly was only partly successful.”</w:t>
+            </w:r>
+            <w:r>
+              <w:t xml:space="preserve"> </w:t>
+            </w:r>
+            <w:r>
+              <w:rPr>
+                <w:b/>
+                <w:bCs/>
+              </w:rPr>
+              <w:t xml:space="preserve">Discussion, closing paragraph.</w:t>
+            </w:r>
+            <w:r>
+              <w:t xml:space="preserve"> </w:t>
+            </w:r>
+            <w:r>
+              <w:t xml:space="preserve">“Endometrial biopsy performed during an already-scheduled surveillance colonoscopy costs less, and exposes patients to less D&amp;C-related procedural risk, than either standalone office biopsy or operative D&amp;C for Lynch syndrome surveillance. This conclusion was robust to parameter uncertainty and practice location in every sensitivity analysis performed.”</w:t>
             </w:r>
           </w:p>
         </w:tc>
@@ -1338,7 +1813,32 @@
               <w:pStyle w:val="Compact"/>
             </w:pPr>
             <w:r>
-              <w:t xml:space="preserve">Title Page</w:t>
+              <w:rPr>
+                <w:b/>
+                <w:bCs/>
+              </w:rPr>
+              <w:t xml:space="preserve">Title Page.</w:t>
+            </w:r>
+            <w:r>
+              <w:t xml:space="preserve"> </w:t>
+            </w:r>
+            <w:r>
+              <w:t xml:space="preserve">“Disclosure of funding received for this work: [State any funding from organizations such as NIH, or state</w:t>
+            </w:r>
+            <w:r>
+              <w:t xml:space="preserve"> </w:t>
+            </w:r>
+            <w:r>
+              <w:t xml:space="preserve">‘No funding was received for this work.’</w:t>
+            </w:r>
+            <w:r>
+              <w:t xml:space="preserve">]”</w:t>
+            </w:r>
+            <w:r>
+              <w:t xml:space="preserve"> </w:t>
+            </w:r>
+            <w:r>
+              <w:t xml:space="preserve">The reporting field exists; the author has not yet supplied the actual funding statement, so no sentence can be quoted as satisfied yet.</w:t>
             </w:r>
           </w:p>
         </w:tc>
@@ -1384,7 +1884,32 @@
               <w:pStyle w:val="Compact"/>
             </w:pPr>
             <w:r>
-              <w:t xml:space="preserve">Title Page</w:t>
+              <w:rPr>
+                <w:b/>
+                <w:bCs/>
+              </w:rPr>
+              <w:t xml:space="preserve">Title Page.</w:t>
+            </w:r>
+            <w:r>
+              <w:t xml:space="preserve"> </w:t>
+            </w:r>
+            <w:r>
+              <w:t xml:space="preserve">“Disclosure of financial support: [State any source of financial support for the study, including supplies or services from a commercial organization, or state</w:t>
+            </w:r>
+            <w:r>
+              <w:t xml:space="preserve"> </w:t>
+            </w:r>
+            <w:r>
+              <w:t xml:space="preserve">‘The authors did not report any potential conflicts of interest.’</w:t>
+            </w:r>
+            <w:r>
+              <w:t xml:space="preserve">]”</w:t>
+            </w:r>
+            <w:r>
+              <w:t xml:space="preserve"> </w:t>
+            </w:r>
+            <w:r>
+              <w:t xml:space="preserve">The reporting field exists; the author has not yet supplied the actual disclosure, so no sentence can be quoted as satisfied yet.</w:t>
             </w:r>
           </w:p>
         </w:tc>

</xml_diff>

<commit_message>
Fix title/precis over the journal's limits; verify abstract has none
Title was 109 characters against the 100-character limit -- dropped the
": A Decision-Analytic Model" suffix (now 82 chars; the Abstract's
Objective already names all three compared strategies). Precis was 29
words against the 25-word limit -- trimmed to exactly 25, keeping both
substantive claims (cheaper; robust across locations).

Fetched the live Instructions for Authors to resolve the manuscript's own
flagged uncertainty about an abstract word limit: there isn't one, only
the required headings. Found and documented a real, previously-unchecked
constraint on the same fetch -- Introduction <=250 words, Discussion
<=750 words -- both already satisfied (234, 673) but not yet written down
anywhere in the repo.

Re-rendered manuscript.qmd, title_page.qmd, and cheers_checklist.qmd to
docx.
</commit_message>
<xml_diff>
--- a/manuscript/cheers_checklist.docx
+++ b/manuscript/cheers_checklist.docx
@@ -27,7 +27,7 @@
         <w:t xml:space="preserve"> </w:t>
       </w:r>
       <w:r>
-        <w:t xml:space="preserve">Strategies for Lynch Syndrome Surveillance: A Decision-Analytic Model.</w:t>
+        <w:t xml:space="preserve">Strategies for Lynch Syndrome Surveillance.</w:t>
       </w:r>
     </w:p>
     <w:p>
@@ -163,7 +163,7 @@
               <w:t xml:space="preserve"> </w:t>
             </w:r>
             <w:r>
-              <w:t xml:space="preserve">“Cost-Minimization of Endometrial Biopsy Strategies for Lynch Syndrome Surveillance: A Decision-Analytic Model.”</w:t>
+              <w:t xml:space="preserve">“Cost-Minimization of Endometrial Biopsy Strategies for Lynch Syndrome Surveillance.”</w:t>
             </w:r>
             <w:r>
               <w:t xml:space="preserve"> </w:t>

</xml_diff>

<commit_message>
Add NCCN's TVUS position to Methods; fix a stale Adambekov citation the Kandil swap missed
Methods now states why transvaginal ultrasound isn't modeled as a fourth
comparator, citing NCCN's own guideline (insufficient sensitivity/specificity
vs. endometrial biopsy). Verified via secondary-source corroboration since
the primary NCCN PDF remains login-gated.

While sourcing that, found that the prior Adambekov-to-Kandil parameter swap
had updated every derived number but missed three places that described the
evidence in prose: the Methods "Clinical probabilities" paragraph, the
Discussion's limitations paragraph, and reference 15 itself (still Adambekov,
now cited nowhere else). Fixed all three -- reference 15 is now Kandil et al.
2014. Discussion tightened to stay under the 750-word limit (735/750).

Co-Authored-By: Claude Sonnet 5 <noreply@anthropic.com>
Claude-Session: https://claude.ai/code/session_01KhD5NpPuPbV1Cc64rkK4GD
</commit_message>
<xml_diff>
--- a/manuscript/cheers_checklist.docx
+++ b/manuscript/cheers_checklist.docx
@@ -531,7 +531,7 @@
               <w:t xml:space="preserve"> </w:t>
             </w:r>
             <w:r>
-              <w:t xml:space="preserve">“…standalone office endometrial biopsy, operative dilation and curettage (D&amp;C), and endometrial biopsy performed during that colonoscopy (combined biopsy).”</w:t>
+              <w:t xml:space="preserve">“…standalone office endometrial biopsy, operative dilation and curettage (D&amp;C), and endometrial biopsy performed during that colonoscopy (combined biopsy). Transvaginal ultrasound was not modeled as a fourth comparator: NCCN’s own guideline states that transvaginal ultrasound has not been shown to have sufficient sensitivity or specificity to support a screening recommendation in this population, in contrast to endometrial biopsy.”</w:t>
             </w:r>
             <w:r>
               <w:t xml:space="preserve"> </w:t>
@@ -843,7 +843,7 @@
               <w:t xml:space="preserve"> </w:t>
             </w:r>
             <w:r>
-              <w:t xml:space="preserve">“After a failed office attempt, we modeled two pathways rather than assuming universal escalation to D&amp;C: a repeat office attempt, estimated to occur in 5% of failures… succeeding 25% of the time… or direct escalation to D&amp;C.”</w:t>
+              <w:t xml:space="preserve">“After a failed office attempt, we modeled two pathways rather than assuming universal escalation to D&amp;C: a repeat office attempt, estimated to occur in 5% of failures… succeeding 75% of the time… or direct escalation to D&amp;C.”</w:t>
             </w:r>
             <w:r>
               <w:t xml:space="preserve"> </w:t>

</xml_diff>

<commit_message>
Add the cost-consequence analysis to the manuscript text
Per author's explicit choice ("trim more to fit" over leaving it
undocumented or cutting other findings): reports the cost-consequence
secondary analysis added in the prior commit. New Methods sentence, new
Results paragraph (four ICERs: $20,843/$33,437 for cancer, $36,823/
$59,073 for AEH), and the Discussion's limitations sentence extended by
2 words. No new reference needed -- reuses reference 17.

To make room, five existing Methods passages were tightened (no content
change): the five-analyses enumeration, the combined-arm incremental-
cost-principle sentence, the geographic/patient-level heterogeneity
sentence, the structural-assumptions sentence, and the analytic-horizon
sentence. Final counts: Introduction 244/250, Discussion 750/750 (at
the limit), total 2,990/3,000.

Co-Authored-By: Claude Sonnet 5 <noreply@anthropic.com>
Claude-Session: https://claude.ai/code/session_01KhD5NpPuPbV1Cc64rkK4GD
</commit_message>
<xml_diff>
--- a/manuscript/cheers_checklist.docx
+++ b/manuscript/cheers_checklist.docx
@@ -898,6 +898,22 @@
             </w:r>
             <w:r>
               <w:t xml:space="preserve">“As a separate, deterministic check on the same equivalent-effectiveness assumption, we also computed each strategy’s overall probability of detecting a true cancer or endometrial hyperplasia, combining each arm’s sampling-escalation probabilities with published Pipelle and D&amp;C sensitivities from a general (non-Lynch) diagnostic-accuracy meta-analysis. This calculation is a point estimate only, not integrated into the probabilistic sensitivity analysis.”</w:t>
+            </w:r>
+            <w:r>
+              <w:t xml:space="preserve"> </w:t>
+            </w:r>
+            <w:r>
+              <w:rPr>
+                <w:b/>
+                <w:bCs/>
+              </w:rPr>
+              <w:t xml:space="preserve">Methods, cost-consequence secondary check.</w:t>
+            </w:r>
+            <w:r>
+              <w:t xml:space="preserve"> </w:t>
+            </w:r>
+            <w:r>
+              <w:t xml:space="preserve">“As a lighter alternative to a full cost-utility analysis, we also computed cost per additional true case detected between adjacent strategies, combining costs with the detection probabilities above and checking for dominance – also a point estimate, not PSA-integrated.”</w:t>
             </w:r>
           </w:p>
         </w:tc>

</xml_diff>